<commit_message>
docs: faculty presentation guide (PDF) with diagrams, results charts and demo prep
21-page guide built from the measured results (docs/reports/data): summary, problem and
leakage analysis, concept/architecture/workflow/model diagrams, evaluation method, results
(accuracy, robustness, abstention, fairness, scorecard), honest findings, dashboard
screenshots, 12-minute script, demo runbook, faculty Q&A and glossary. Rebuild with
python docs/presentation/build_guide.py. Test counts updated to 64 in the final report.

Co-Authored-By: Claude Opus 5.5 <noreply@anthropic.com>
</commit_message>
<xml_diff>
--- a/docs/reports/RAMEI-Final-Report.docx
+++ b/docs/reports/RAMEI-Final-Report.docx
@@ -1232,7 +1232,7 @@
         <w:spacing w:after="60"/>
       </w:pPr>
       <w:r>
-        <w:t xml:space="preserve">Engineering practice: architecture decision records, CI, 62 automated tests, container images.</w:t>
+        <w:t xml:space="preserve">Engineering practice: architecture decision records, CI, 64 automated tests, container images.</w:t>
       </w:r>
     </w:p>
     <w:p>
@@ -3647,7 +3647,7 @@
         <w:t xml:space="preserve">Tests:</w:t>
       </w:r>
       <w:r>
-        <w:t xml:space="preserve"> 62 automated tests (38 ML, 19 backend, 5 frontend) that run without datasets.</w:t>
+        <w:t xml:space="preserve"> 64 automated tests (39 ML, 20 backend, 5 frontend) that run without datasets.</w:t>
       </w:r>
     </w:p>
     <w:p>

</xml_diff>